<commit_message>
refactor(memo-45): update tracking table layout to single-line header and scale table to fit page
</commit_message>
<xml_diff>
--- a/frontend/static/docs/ขอส่งใบติดตามทวงถาม_45_วัน_Rebuild_Thai.docx
+++ b/frontend/static/docs/ขอส่งใบติดตามทวงถาม_45_วัน_Rebuild_Thai.docx
@@ -255,7 +255,7 @@
         <w:tabs>
           <w:tab w:pos="5947" w:val="right"/>
         </w:tabs>
-        <w:spacing w:before="1100" w:after="440"/>
+        <w:spacing w:before="0" w:after="440"/>
       </w:pPr>
       <w:r>
         <w:rPr>
@@ -1415,228 +1415,6 @@
           <w:p/>
         </w:tc>
       </w:tr>
-      <w:tr>
-        <w:tc>
-          <w:tcPr>
-            <w:tcW w:type="dxa" w:w="864"/>
-            <w:tcBorders>
-              <w:top w:val="single" w:color="000000" w:sz="4"/>
-              <w:left w:val="single" w:color="000000" w:sz="4"/>
-              <w:bottom w:val="single" w:color="000000" w:sz="4"/>
-              <w:right w:val="single" w:color="000000" w:sz="4"/>
-            </w:tcBorders>
-          </w:tcPr>
-          <w:p/>
-        </w:tc>
-        <w:tc>
-          <w:tcPr>
-            <w:tcW w:type="dxa" w:w="4608"/>
-            <w:tcBorders>
-              <w:top w:val="single" w:color="000000" w:sz="4"/>
-              <w:left w:val="single" w:color="000000" w:sz="4"/>
-              <w:bottom w:val="single" w:color="000000" w:sz="4"/>
-              <w:right w:val="single" w:color="000000" w:sz="4"/>
-            </w:tcBorders>
-          </w:tcPr>
-          <w:p/>
-        </w:tc>
-        <w:tc>
-          <w:tcPr>
-            <w:tcW w:type="dxa" w:w="3888"/>
-            <w:tcBorders>
-              <w:top w:val="single" w:color="000000" w:sz="4"/>
-              <w:left w:val="single" w:color="000000" w:sz="4"/>
-              <w:bottom w:val="single" w:color="000000" w:sz="4"/>
-              <w:right w:val="single" w:color="000000" w:sz="4"/>
-            </w:tcBorders>
-          </w:tcPr>
-          <w:p/>
-        </w:tc>
-        <w:tc>
-          <w:tcPr>
-            <w:tcW w:type="dxa" w:w="2736"/>
-            <w:tcBorders>
-              <w:top w:val="single" w:color="000000" w:sz="4"/>
-              <w:left w:val="single" w:color="000000" w:sz="4"/>
-              <w:bottom w:val="single" w:color="000000" w:sz="4"/>
-              <w:right w:val="single" w:color="000000" w:sz="4"/>
-            </w:tcBorders>
-          </w:tcPr>
-          <w:p/>
-        </w:tc>
-        <w:tc>
-          <w:tcPr>
-            <w:tcW w:type="dxa" w:w="2736"/>
-            <w:tcBorders>
-              <w:top w:val="single" w:color="000000" w:sz="4"/>
-              <w:left w:val="single" w:color="000000" w:sz="4"/>
-              <w:bottom w:val="single" w:color="000000" w:sz="4"/>
-              <w:right w:val="single" w:color="000000" w:sz="4"/>
-            </w:tcBorders>
-          </w:tcPr>
-          <w:p/>
-        </w:tc>
-        <w:tc>
-          <w:tcPr>
-            <w:tcW w:type="dxa" w:w="3600"/>
-            <w:tcBorders>
-              <w:top w:val="single" w:color="000000" w:sz="4"/>
-              <w:left w:val="single" w:color="000000" w:sz="4"/>
-              <w:bottom w:val="single" w:color="000000" w:sz="4"/>
-              <w:right w:val="single" w:color="000000" w:sz="4"/>
-            </w:tcBorders>
-          </w:tcPr>
-          <w:p/>
-        </w:tc>
-      </w:tr>
-      <w:tr>
-        <w:tc>
-          <w:tcPr>
-            <w:tcW w:type="dxa" w:w="864"/>
-            <w:tcBorders>
-              <w:top w:val="single" w:color="000000" w:sz="4"/>
-              <w:left w:val="single" w:color="000000" w:sz="4"/>
-              <w:bottom w:val="single" w:color="000000" w:sz="4"/>
-              <w:right w:val="single" w:color="000000" w:sz="4"/>
-            </w:tcBorders>
-          </w:tcPr>
-          <w:p/>
-        </w:tc>
-        <w:tc>
-          <w:tcPr>
-            <w:tcW w:type="dxa" w:w="4608"/>
-            <w:tcBorders>
-              <w:top w:val="single" w:color="000000" w:sz="4"/>
-              <w:left w:val="single" w:color="000000" w:sz="4"/>
-              <w:bottom w:val="single" w:color="000000" w:sz="4"/>
-              <w:right w:val="single" w:color="000000" w:sz="4"/>
-            </w:tcBorders>
-          </w:tcPr>
-          <w:p/>
-        </w:tc>
-        <w:tc>
-          <w:tcPr>
-            <w:tcW w:type="dxa" w:w="3888"/>
-            <w:tcBorders>
-              <w:top w:val="single" w:color="000000" w:sz="4"/>
-              <w:left w:val="single" w:color="000000" w:sz="4"/>
-              <w:bottom w:val="single" w:color="000000" w:sz="4"/>
-              <w:right w:val="single" w:color="000000" w:sz="4"/>
-            </w:tcBorders>
-          </w:tcPr>
-          <w:p/>
-        </w:tc>
-        <w:tc>
-          <w:tcPr>
-            <w:tcW w:type="dxa" w:w="2736"/>
-            <w:tcBorders>
-              <w:top w:val="single" w:color="000000" w:sz="4"/>
-              <w:left w:val="single" w:color="000000" w:sz="4"/>
-              <w:bottom w:val="single" w:color="000000" w:sz="4"/>
-              <w:right w:val="single" w:color="000000" w:sz="4"/>
-            </w:tcBorders>
-          </w:tcPr>
-          <w:p/>
-        </w:tc>
-        <w:tc>
-          <w:tcPr>
-            <w:tcW w:type="dxa" w:w="2736"/>
-            <w:tcBorders>
-              <w:top w:val="single" w:color="000000" w:sz="4"/>
-              <w:left w:val="single" w:color="000000" w:sz="4"/>
-              <w:bottom w:val="single" w:color="000000" w:sz="4"/>
-              <w:right w:val="single" w:color="000000" w:sz="4"/>
-            </w:tcBorders>
-          </w:tcPr>
-          <w:p/>
-        </w:tc>
-        <w:tc>
-          <w:tcPr>
-            <w:tcW w:type="dxa" w:w="3600"/>
-            <w:tcBorders>
-              <w:top w:val="single" w:color="000000" w:sz="4"/>
-              <w:left w:val="single" w:color="000000" w:sz="4"/>
-              <w:bottom w:val="single" w:color="000000" w:sz="4"/>
-              <w:right w:val="single" w:color="000000" w:sz="4"/>
-            </w:tcBorders>
-          </w:tcPr>
-          <w:p/>
-        </w:tc>
-      </w:tr>
-      <w:tr>
-        <w:tc>
-          <w:tcPr>
-            <w:tcW w:type="dxa" w:w="864"/>
-            <w:tcBorders>
-              <w:top w:val="single" w:color="000000" w:sz="4"/>
-              <w:left w:val="single" w:color="000000" w:sz="4"/>
-              <w:bottom w:val="single" w:color="000000" w:sz="4"/>
-              <w:right w:val="single" w:color="000000" w:sz="4"/>
-            </w:tcBorders>
-          </w:tcPr>
-          <w:p/>
-        </w:tc>
-        <w:tc>
-          <w:tcPr>
-            <w:tcW w:type="dxa" w:w="4608"/>
-            <w:tcBorders>
-              <w:top w:val="single" w:color="000000" w:sz="4"/>
-              <w:left w:val="single" w:color="000000" w:sz="4"/>
-              <w:bottom w:val="single" w:color="000000" w:sz="4"/>
-              <w:right w:val="single" w:color="000000" w:sz="4"/>
-            </w:tcBorders>
-          </w:tcPr>
-          <w:p/>
-        </w:tc>
-        <w:tc>
-          <w:tcPr>
-            <w:tcW w:type="dxa" w:w="3888"/>
-            <w:tcBorders>
-              <w:top w:val="single" w:color="000000" w:sz="4"/>
-              <w:left w:val="single" w:color="000000" w:sz="4"/>
-              <w:bottom w:val="single" w:color="000000" w:sz="4"/>
-              <w:right w:val="single" w:color="000000" w:sz="4"/>
-            </w:tcBorders>
-          </w:tcPr>
-          <w:p/>
-        </w:tc>
-        <w:tc>
-          <w:tcPr>
-            <w:tcW w:type="dxa" w:w="2736"/>
-            <w:tcBorders>
-              <w:top w:val="single" w:color="000000" w:sz="4"/>
-              <w:left w:val="single" w:color="000000" w:sz="4"/>
-              <w:bottom w:val="single" w:color="000000" w:sz="4"/>
-              <w:right w:val="single" w:color="000000" w:sz="4"/>
-            </w:tcBorders>
-          </w:tcPr>
-          <w:p/>
-        </w:tc>
-        <w:tc>
-          <w:tcPr>
-            <w:tcW w:type="dxa" w:w="2736"/>
-            <w:tcBorders>
-              <w:top w:val="single" w:color="000000" w:sz="4"/>
-              <w:left w:val="single" w:color="000000" w:sz="4"/>
-              <w:bottom w:val="single" w:color="000000" w:sz="4"/>
-              <w:right w:val="single" w:color="000000" w:sz="4"/>
-            </w:tcBorders>
-          </w:tcPr>
-          <w:p/>
-        </w:tc>
-        <w:tc>
-          <w:tcPr>
-            <w:tcW w:type="dxa" w:w="3600"/>
-            <w:tcBorders>
-              <w:top w:val="single" w:color="000000" w:sz="4"/>
-              <w:left w:val="single" w:color="000000" w:sz="4"/>
-              <w:bottom w:val="single" w:color="000000" w:sz="4"/>
-              <w:right w:val="single" w:color="000000" w:sz="4"/>
-            </w:tcBorders>
-          </w:tcPr>
-          <w:p/>
-        </w:tc>
-      </w:tr>
     </w:tbl>
     <w:p>
       <w:pPr>
@@ -1731,7 +1509,7 @@
                 <w:sz w:val="24"/>
               </w:rPr>
               <w:tab/>
-              <w:t>ต.ค. ๕๗</w:t>
+              <w:t xml:space="preserve">          ต.ค. ๕๗</w:t>
             </w:r>
           </w:p>
         </w:tc>
@@ -1744,9 +1522,9 @@
           <w:p>
             <w:pPr>
               <w:tabs>
-                <w:tab w:pos="3168" w:val="left"/>
+                <w:tab w:pos="4320" w:val="right"/>
               </w:tabs>
-              <w:spacing w:before="0" w:after="320"/>
+              <w:spacing w:before="0" w:after="40"/>
             </w:pPr>
             <w:r>
               <w:rPr>
@@ -1823,7 +1601,7 @@
                 <w:sz w:val="24"/>
               </w:rPr>
               <w:tab/>
-              <w:t>ต.ค. ๕๗</w:t>
+              <w:t xml:space="preserve">          ต.ค. ๕๗</w:t>
             </w:r>
           </w:p>
         </w:tc>
@@ -2698,228 +2476,6 @@
           <w:p/>
         </w:tc>
       </w:tr>
-      <w:tr>
-        <w:tc>
-          <w:tcPr>
-            <w:tcW w:type="dxa" w:w="864"/>
-            <w:tcBorders>
-              <w:top w:val="single" w:color="000000" w:sz="4"/>
-              <w:left w:val="single" w:color="000000" w:sz="4"/>
-              <w:bottom w:val="single" w:color="000000" w:sz="4"/>
-              <w:right w:val="single" w:color="000000" w:sz="4"/>
-            </w:tcBorders>
-          </w:tcPr>
-          <w:p/>
-        </w:tc>
-        <w:tc>
-          <w:tcPr>
-            <w:tcW w:type="dxa" w:w="4608"/>
-            <w:tcBorders>
-              <w:top w:val="single" w:color="000000" w:sz="4"/>
-              <w:left w:val="single" w:color="000000" w:sz="4"/>
-              <w:bottom w:val="single" w:color="000000" w:sz="4"/>
-              <w:right w:val="single" w:color="000000" w:sz="4"/>
-            </w:tcBorders>
-          </w:tcPr>
-          <w:p/>
-        </w:tc>
-        <w:tc>
-          <w:tcPr>
-            <w:tcW w:type="dxa" w:w="3888"/>
-            <w:tcBorders>
-              <w:top w:val="single" w:color="000000" w:sz="4"/>
-              <w:left w:val="single" w:color="000000" w:sz="4"/>
-              <w:bottom w:val="single" w:color="000000" w:sz="4"/>
-              <w:right w:val="single" w:color="000000" w:sz="4"/>
-            </w:tcBorders>
-          </w:tcPr>
-          <w:p/>
-        </w:tc>
-        <w:tc>
-          <w:tcPr>
-            <w:tcW w:type="dxa" w:w="2736"/>
-            <w:tcBorders>
-              <w:top w:val="single" w:color="000000" w:sz="4"/>
-              <w:left w:val="single" w:color="000000" w:sz="4"/>
-              <w:bottom w:val="single" w:color="000000" w:sz="4"/>
-              <w:right w:val="single" w:color="000000" w:sz="4"/>
-            </w:tcBorders>
-          </w:tcPr>
-          <w:p/>
-        </w:tc>
-        <w:tc>
-          <w:tcPr>
-            <w:tcW w:type="dxa" w:w="2736"/>
-            <w:tcBorders>
-              <w:top w:val="single" w:color="000000" w:sz="4"/>
-              <w:left w:val="single" w:color="000000" w:sz="4"/>
-              <w:bottom w:val="single" w:color="000000" w:sz="4"/>
-              <w:right w:val="single" w:color="000000" w:sz="4"/>
-            </w:tcBorders>
-          </w:tcPr>
-          <w:p/>
-        </w:tc>
-        <w:tc>
-          <w:tcPr>
-            <w:tcW w:type="dxa" w:w="3600"/>
-            <w:tcBorders>
-              <w:top w:val="single" w:color="000000" w:sz="4"/>
-              <w:left w:val="single" w:color="000000" w:sz="4"/>
-              <w:bottom w:val="single" w:color="000000" w:sz="4"/>
-              <w:right w:val="single" w:color="000000" w:sz="4"/>
-            </w:tcBorders>
-          </w:tcPr>
-          <w:p/>
-        </w:tc>
-      </w:tr>
-      <w:tr>
-        <w:tc>
-          <w:tcPr>
-            <w:tcW w:type="dxa" w:w="864"/>
-            <w:tcBorders>
-              <w:top w:val="single" w:color="000000" w:sz="4"/>
-              <w:left w:val="single" w:color="000000" w:sz="4"/>
-              <w:bottom w:val="single" w:color="000000" w:sz="4"/>
-              <w:right w:val="single" w:color="000000" w:sz="4"/>
-            </w:tcBorders>
-          </w:tcPr>
-          <w:p/>
-        </w:tc>
-        <w:tc>
-          <w:tcPr>
-            <w:tcW w:type="dxa" w:w="4608"/>
-            <w:tcBorders>
-              <w:top w:val="single" w:color="000000" w:sz="4"/>
-              <w:left w:val="single" w:color="000000" w:sz="4"/>
-              <w:bottom w:val="single" w:color="000000" w:sz="4"/>
-              <w:right w:val="single" w:color="000000" w:sz="4"/>
-            </w:tcBorders>
-          </w:tcPr>
-          <w:p/>
-        </w:tc>
-        <w:tc>
-          <w:tcPr>
-            <w:tcW w:type="dxa" w:w="3888"/>
-            <w:tcBorders>
-              <w:top w:val="single" w:color="000000" w:sz="4"/>
-              <w:left w:val="single" w:color="000000" w:sz="4"/>
-              <w:bottom w:val="single" w:color="000000" w:sz="4"/>
-              <w:right w:val="single" w:color="000000" w:sz="4"/>
-            </w:tcBorders>
-          </w:tcPr>
-          <w:p/>
-        </w:tc>
-        <w:tc>
-          <w:tcPr>
-            <w:tcW w:type="dxa" w:w="2736"/>
-            <w:tcBorders>
-              <w:top w:val="single" w:color="000000" w:sz="4"/>
-              <w:left w:val="single" w:color="000000" w:sz="4"/>
-              <w:bottom w:val="single" w:color="000000" w:sz="4"/>
-              <w:right w:val="single" w:color="000000" w:sz="4"/>
-            </w:tcBorders>
-          </w:tcPr>
-          <w:p/>
-        </w:tc>
-        <w:tc>
-          <w:tcPr>
-            <w:tcW w:type="dxa" w:w="2736"/>
-            <w:tcBorders>
-              <w:top w:val="single" w:color="000000" w:sz="4"/>
-              <w:left w:val="single" w:color="000000" w:sz="4"/>
-              <w:bottom w:val="single" w:color="000000" w:sz="4"/>
-              <w:right w:val="single" w:color="000000" w:sz="4"/>
-            </w:tcBorders>
-          </w:tcPr>
-          <w:p/>
-        </w:tc>
-        <w:tc>
-          <w:tcPr>
-            <w:tcW w:type="dxa" w:w="3600"/>
-            <w:tcBorders>
-              <w:top w:val="single" w:color="000000" w:sz="4"/>
-              <w:left w:val="single" w:color="000000" w:sz="4"/>
-              <w:bottom w:val="single" w:color="000000" w:sz="4"/>
-              <w:right w:val="single" w:color="000000" w:sz="4"/>
-            </w:tcBorders>
-          </w:tcPr>
-          <w:p/>
-        </w:tc>
-      </w:tr>
-      <w:tr>
-        <w:tc>
-          <w:tcPr>
-            <w:tcW w:type="dxa" w:w="864"/>
-            <w:tcBorders>
-              <w:top w:val="single" w:color="000000" w:sz="4"/>
-              <w:left w:val="single" w:color="000000" w:sz="4"/>
-              <w:bottom w:val="single" w:color="000000" w:sz="4"/>
-              <w:right w:val="single" w:color="000000" w:sz="4"/>
-            </w:tcBorders>
-          </w:tcPr>
-          <w:p/>
-        </w:tc>
-        <w:tc>
-          <w:tcPr>
-            <w:tcW w:type="dxa" w:w="4608"/>
-            <w:tcBorders>
-              <w:top w:val="single" w:color="000000" w:sz="4"/>
-              <w:left w:val="single" w:color="000000" w:sz="4"/>
-              <w:bottom w:val="single" w:color="000000" w:sz="4"/>
-              <w:right w:val="single" w:color="000000" w:sz="4"/>
-            </w:tcBorders>
-          </w:tcPr>
-          <w:p/>
-        </w:tc>
-        <w:tc>
-          <w:tcPr>
-            <w:tcW w:type="dxa" w:w="3888"/>
-            <w:tcBorders>
-              <w:top w:val="single" w:color="000000" w:sz="4"/>
-              <w:left w:val="single" w:color="000000" w:sz="4"/>
-              <w:bottom w:val="single" w:color="000000" w:sz="4"/>
-              <w:right w:val="single" w:color="000000" w:sz="4"/>
-            </w:tcBorders>
-          </w:tcPr>
-          <w:p/>
-        </w:tc>
-        <w:tc>
-          <w:tcPr>
-            <w:tcW w:type="dxa" w:w="2736"/>
-            <w:tcBorders>
-              <w:top w:val="single" w:color="000000" w:sz="4"/>
-              <w:left w:val="single" w:color="000000" w:sz="4"/>
-              <w:bottom w:val="single" w:color="000000" w:sz="4"/>
-              <w:right w:val="single" w:color="000000" w:sz="4"/>
-            </w:tcBorders>
-          </w:tcPr>
-          <w:p/>
-        </w:tc>
-        <w:tc>
-          <w:tcPr>
-            <w:tcW w:type="dxa" w:w="2736"/>
-            <w:tcBorders>
-              <w:top w:val="single" w:color="000000" w:sz="4"/>
-              <w:left w:val="single" w:color="000000" w:sz="4"/>
-              <w:bottom w:val="single" w:color="000000" w:sz="4"/>
-              <w:right w:val="single" w:color="000000" w:sz="4"/>
-            </w:tcBorders>
-          </w:tcPr>
-          <w:p/>
-        </w:tc>
-        <w:tc>
-          <w:tcPr>
-            <w:tcW w:type="dxa" w:w="3600"/>
-            <w:tcBorders>
-              <w:top w:val="single" w:color="000000" w:sz="4"/>
-              <w:left w:val="single" w:color="000000" w:sz="4"/>
-              <w:bottom w:val="single" w:color="000000" w:sz="4"/>
-              <w:right w:val="single" w:color="000000" w:sz="4"/>
-            </w:tcBorders>
-          </w:tcPr>
-          <w:p/>
-        </w:tc>
-      </w:tr>
     </w:tbl>
     <w:p>
       <w:pPr>
@@ -3014,7 +2570,7 @@
                 <w:sz w:val="24"/>
               </w:rPr>
               <w:tab/>
-              <w:t>มิ.ย. ๔๗</w:t>
+              <w:t xml:space="preserve">          มิ.ย. ๔๗</w:t>
             </w:r>
           </w:p>
         </w:tc>
@@ -3027,9 +2583,9 @@
           <w:p>
             <w:pPr>
               <w:tabs>
-                <w:tab w:pos="3168" w:val="left"/>
+                <w:tab w:pos="4320" w:val="right"/>
               </w:tabs>
-              <w:spacing w:before="0" w:after="320"/>
+              <w:spacing w:before="0" w:after="40"/>
             </w:pPr>
             <w:r>
               <w:rPr>
@@ -3106,7 +2662,7 @@
                 <w:sz w:val="24"/>
               </w:rPr>
               <w:tab/>
-              <w:t>มิ.ย. ๔๗</w:t>
+              <w:t xml:space="preserve">          มิ.ย. ๔๗</w:t>
             </w:r>
           </w:p>
         </w:tc>

</xml_diff>